<commit_message>
Enforce captions for generated VКР tables
Co-authored-by: Колесников Владислав <krons2486@users.noreply.github.com>
</commit_message>
<xml_diff>
--- a/vkr/work_assembly_tool/out/thesis_draft_final_ru.docx
+++ b/vkr/work_assembly_tool/out/thesis_draft_final_ru.docx
@@ -792,6 +792,14 @@
           <w:i w:val="0"/>
         </w:rPr>
         <w:t>; отдельные публичные маршруты для самостоятельного построения эмбеддингов вакансии или резюме в коде не реализованы.</w:t>
+      </w:r>
+    </w:p>
+    <w:p>
+      <w:pPr>
+        <w:pStyle w:val="VKRTableCaption"/>
+      </w:pPr>
+      <w:r>
+        <w:t>Таблица 1 – Маршрут, Метод, Входная схема и другие параметры</w:t>
       </w:r>
     </w:p>
     <w:tbl>
@@ -2657,6 +2665,14 @@
           <w:i w:val="0"/>
         </w:rPr>
         <w:t>. Векторное сравнение задается через cosine similarity. Параметры, зафиксированные в файлах артефакта после повторного обучения 10.04.2026, приведены в таблице.</w:t>
+      </w:r>
+    </w:p>
+    <w:p>
+      <w:pPr>
+        <w:pStyle w:val="VKRTableCaption"/>
+      </w:pPr>
+      <w:r>
+        <w:t>Таблица 2 – Параметр, Значение в реализации, Источник</w:t>
       </w:r>
     </w:p>
     <w:tbl>
@@ -3686,6 +3702,14 @@
           <w:i w:val="0"/>
         </w:rPr>
         <w:t>Гиперпараметры и фактические числа повторного запуска обучения приведены в таблице.</w:t>
+      </w:r>
+    </w:p>
+    <w:p>
+      <w:pPr>
+        <w:pStyle w:val="VKRTableCaption"/>
+      </w:pPr>
+      <w:r>
+        <w:t>Таблица 3 – Параметр запуска, Значение, Источник</w:t>
       </w:r>
     </w:p>
     <w:tbl>
@@ -6013,6 +6037,14 @@
         <w:t xml:space="preserve"> вакансий, где есть хотя бы два кандидата и хотя бы один positive.</w:t>
       </w:r>
     </w:p>
+    <w:p>
+      <w:pPr>
+        <w:pStyle w:val="VKRTableCaption"/>
+      </w:pPr>
+      <w:r>
+        <w:t>Таблица 4 – Метрика на полном test.tsv, Значение, Область усреднения</w:t>
+      </w:r>
+    </w:p>
     <w:tbl>
       <w:tblPr>
         <w:tblStyle w:val="TableGrid"/>
@@ -8323,6 +8355,14 @@
         <w:t>, один LLM-вызов на одну application. Тогда estimate-based стоимость одного application scoring равна:</w:t>
       </w:r>
     </w:p>
+    <w:p>
+      <w:pPr>
+        <w:pStyle w:val="VKRTableCaption"/>
+      </w:pPr>
+      <w:r>
+        <w:t>Таблица 5 – Модель, Формула, Estimate cost / application и другие параметры</w:t>
+      </w:r>
+    </w:p>
     <w:tbl>
       <w:tblPr>
         <w:tblStyle w:val="TableGrid"/>
@@ -9378,6 +9418,14 @@
           <w:i w:val="0"/>
         </w:rPr>
         <w:t>Офлайн-оценку целесообразно разделить на два уровня.</w:t>
+      </w:r>
+    </w:p>
+    <w:p>
+      <w:pPr>
+        <w:pStyle w:val="VKRTableCaption"/>
+      </w:pPr>
+      <w:r>
+        <w:t>Таблица 6 – Уровень оценки, Что измеряется, Артефакты</w:t>
       </w:r>
     </w:p>
     <w:tbl>

</xml_diff>

<commit_message>
Use local PlantUML jar for offline diagram rendering
Render diagrams via java -jar tools/plantuml.jar instead of plantuml.com, add setup and optional picoweb server scripts, and document the local workflow.

Co-authored-by: Cursor <cursoragent@cursor.com>
</commit_message>
<xml_diff>
--- a/vkr/work_assembly_tool/out/thesis_draft_final_ru.docx
+++ b/vkr/work_assembly_tool/out/thesis_draft_final_ru.docx
@@ -4430,7 +4430,7 @@
       <w:r>
         <w:drawing>
           <wp:inline xmlns:a="http://schemas.openxmlformats.org/drawingml/2006/main" xmlns:pic="http://schemas.openxmlformats.org/drawingml/2006/picture">
-            <wp:extent cx="5400000" cy="4752365"/>
+            <wp:extent cx="5400000" cy="5339439"/>
             <wp:docPr id="2" name="Picture 1"/>
             <wp:cNvGraphicFramePr>
               <a:graphicFrameLocks noChangeAspect="1"/>
@@ -4451,7 +4451,7 @@
                   <pic:spPr>
                     <a:xfrm>
                       <a:off x="0" y="0"/>
-                      <a:ext cx="5400000" cy="4752365"/>
+                      <a:ext cx="5400000" cy="5339439"/>
                     </a:xfrm>
                     <a:prstGeom prst="rect"/>
                   </pic:spPr>

</xml_diff>